<commit_message>
feat: Credential manager for auto login, restart and clear button (errors)
</commit_message>
<xml_diff>
--- a/Espot Browser Documentation.docx
+++ b/Espot Browser Documentation.docx
@@ -178,6 +178,29 @@
           <w:b/>
           <w:bCs/>
         </w:rPr>
+        <w:t>credential_manager.py</w:t>
+      </w:r>
+      <w:r>
+        <w:t xml:space="preserve"> – Manages the saving of credentials when logging in </w:t>
+      </w:r>
+      <w:proofErr w:type="gramStart"/>
+      <w:r>
+        <w:t>and also</w:t>
+      </w:r>
+      <w:proofErr w:type="gramEnd"/>
+      <w:r>
+        <w:t xml:space="preserve"> handles clearing the session on cleanup.</w:t>
+      </w:r>
+    </w:p>
+    <w:p>
+      <w:pPr>
+        <w:pStyle w:val="ListBullet"/>
+      </w:pPr>
+      <w:r>
+        <w:rPr>
+          <w:b/>
+          <w:bCs/>
+        </w:rPr>
         <w:t>requirements.txt</w:t>
       </w:r>
       <w:r>
@@ -289,8 +312,6 @@
         <w:pStyle w:val="Heading2"/>
       </w:pPr>
     </w:p>
-    <w:p/>
-    <w:p/>
     <w:p/>
     <w:p/>
     <w:p/>

</xml_diff>